<commit_message>
system design v1 revised
</commit_message>
<xml_diff>
--- a/System design.docx
+++ b/System design.docx
@@ -57186,7 +57186,7 @@
           <w:tab w:val="left" w:pos="2360"/>
         </w:tabs>
         <w:rPr>
-          <w:rFonts w:cs="Myanmar Text" w:hint="cs"/>
+          <w:rFonts w:cs="Myanmar Text"/>
           <w:cs/>
           <w:lang w:bidi="my-MM"/>
         </w:rPr>
@@ -60057,8 +60057,7 @@
           <w:tab w:val="left" w:pos="2360"/>
         </w:tabs>
         <w:rPr>
-          <w:rFonts w:cs="Myanmar Text" w:hint="cs"/>
-          <w:cs/>
+          <w:rFonts w:cs="Myanmar Text"/>
           <w:lang w:bidi="my-MM"/>
         </w:rPr>
       </w:pPr>
@@ -60070,6 +60069,1051 @@
         </w:rPr>
         <w:t>==============================================================</w:t>
       </w:r>
+    </w:p>
+    <w:p>
+      <w:pPr>
+        <w:tabs>
+          <w:tab w:val="left" w:pos="340"/>
+          <w:tab w:val="left" w:pos="2360"/>
+        </w:tabs>
+        <w:rPr>
+          <w:rFonts w:cs="Myanmar Text"/>
+          <w:lang w:bidi="my-MM"/>
+        </w:rPr>
+      </w:pPr>
+    </w:p>
+    <w:p>
+      <w:pPr>
+        <w:tabs>
+          <w:tab w:val="left" w:pos="340"/>
+          <w:tab w:val="left" w:pos="2360"/>
+        </w:tabs>
+        <w:rPr>
+          <w:rFonts w:cs="Myanmar Text"/>
+          <w:lang w:bidi="my-MM"/>
+        </w:rPr>
+      </w:pPr>
+    </w:p>
+    <w:p>
+      <w:pPr>
+        <w:tabs>
+          <w:tab w:val="left" w:pos="340"/>
+          <w:tab w:val="left" w:pos="2360"/>
+        </w:tabs>
+        <w:rPr>
+          <w:rFonts w:cs="Myanmar Text"/>
+          <w:lang w:bidi="my-MM"/>
+        </w:rPr>
+      </w:pPr>
+    </w:p>
+    <w:p>
+      <w:pPr>
+        <w:tabs>
+          <w:tab w:val="left" w:pos="340"/>
+          <w:tab w:val="left" w:pos="2360"/>
+        </w:tabs>
+        <w:rPr>
+          <w:rFonts w:cs="Myanmar Text"/>
+          <w:lang w:bidi="my-MM"/>
+        </w:rPr>
+      </w:pPr>
+    </w:p>
+    <w:p>
+      <w:pPr>
+        <w:tabs>
+          <w:tab w:val="left" w:pos="340"/>
+          <w:tab w:val="left" w:pos="2360"/>
+        </w:tabs>
+        <w:rPr>
+          <w:rFonts w:cs="Myanmar Text"/>
+          <w:lang w:bidi="my-MM"/>
+        </w:rPr>
+      </w:pPr>
+    </w:p>
+    <w:p>
+      <w:pPr>
+        <w:tabs>
+          <w:tab w:val="left" w:pos="340"/>
+          <w:tab w:val="left" w:pos="2360"/>
+        </w:tabs>
+        <w:rPr>
+          <w:rFonts w:cs="Myanmar Text"/>
+          <w:lang w:bidi="my-MM"/>
+        </w:rPr>
+      </w:pPr>
+    </w:p>
+    <w:p>
+      <w:pPr>
+        <w:tabs>
+          <w:tab w:val="left" w:pos="340"/>
+          <w:tab w:val="left" w:pos="2360"/>
+        </w:tabs>
+        <w:rPr>
+          <w:rFonts w:cs="Myanmar Text"/>
+          <w:lang w:bidi="my-MM"/>
+        </w:rPr>
+      </w:pPr>
+    </w:p>
+    <w:p>
+      <w:pPr>
+        <w:tabs>
+          <w:tab w:val="left" w:pos="340"/>
+          <w:tab w:val="left" w:pos="2360"/>
+        </w:tabs>
+        <w:rPr>
+          <w:rFonts w:cs="Myanmar Text"/>
+          <w:lang w:bidi="my-MM"/>
+        </w:rPr>
+      </w:pPr>
+    </w:p>
+    <w:p>
+      <w:pPr>
+        <w:tabs>
+          <w:tab w:val="left" w:pos="340"/>
+          <w:tab w:val="left" w:pos="2360"/>
+        </w:tabs>
+        <w:rPr>
+          <w:rFonts w:cs="Myanmar Text"/>
+          <w:lang w:bidi="my-MM"/>
+        </w:rPr>
+      </w:pPr>
+    </w:p>
+    <w:p>
+      <w:pPr>
+        <w:tabs>
+          <w:tab w:val="left" w:pos="340"/>
+          <w:tab w:val="left" w:pos="2360"/>
+        </w:tabs>
+        <w:rPr>
+          <w:rFonts w:cs="Myanmar Text"/>
+          <w:lang w:bidi="my-MM"/>
+        </w:rPr>
+      </w:pPr>
+    </w:p>
+    <w:p>
+      <w:pPr>
+        <w:tabs>
+          <w:tab w:val="left" w:pos="340"/>
+          <w:tab w:val="left" w:pos="2360"/>
+        </w:tabs>
+        <w:rPr>
+          <w:rFonts w:cs="Myanmar Text"/>
+          <w:lang w:bidi="my-MM"/>
+        </w:rPr>
+      </w:pPr>
+    </w:p>
+    <w:p>
+      <w:pPr>
+        <w:tabs>
+          <w:tab w:val="left" w:pos="340"/>
+          <w:tab w:val="left" w:pos="2360"/>
+        </w:tabs>
+        <w:rPr>
+          <w:rFonts w:cs="Myanmar Text"/>
+          <w:lang w:bidi="my-MM"/>
+        </w:rPr>
+      </w:pPr>
+    </w:p>
+    <w:p>
+      <w:pPr>
+        <w:tabs>
+          <w:tab w:val="left" w:pos="340"/>
+          <w:tab w:val="left" w:pos="2360"/>
+        </w:tabs>
+        <w:rPr>
+          <w:rFonts w:cs="Myanmar Text"/>
+          <w:lang w:bidi="my-MM"/>
+        </w:rPr>
+      </w:pPr>
+    </w:p>
+    <w:p>
+      <w:pPr>
+        <w:tabs>
+          <w:tab w:val="left" w:pos="340"/>
+          <w:tab w:val="left" w:pos="2360"/>
+        </w:tabs>
+        <w:rPr>
+          <w:rFonts w:cs="Myanmar Text"/>
+          <w:lang w:bidi="my-MM"/>
+        </w:rPr>
+      </w:pPr>
+    </w:p>
+    <w:p>
+      <w:pPr>
+        <w:tabs>
+          <w:tab w:val="left" w:pos="340"/>
+          <w:tab w:val="left" w:pos="2360"/>
+        </w:tabs>
+        <w:rPr>
+          <w:rFonts w:cs="Myanmar Text"/>
+          <w:lang w:bidi="my-MM"/>
+        </w:rPr>
+      </w:pPr>
+      <w:r>
+        <w:rPr>
+          <w:rFonts w:cs="Myanmar Text" w:hint="cs"/>
+          <w:cs/>
+          <w:lang w:bidi="my-MM"/>
+        </w:rPr>
+        <w:lastRenderedPageBreak/>
+        <w:t xml:space="preserve">အိုကေ ဆက်သွားမယ် ဒီမှာ </w:t>
+      </w:r>
+      <w:r>
+        <w:rPr>
+          <w:rFonts w:cs="Myanmar Text"/>
+          <w:lang w:bidi="my-MM"/>
+        </w:rPr>
+        <w:t xml:space="preserve">senior </w:t>
+      </w:r>
+      <w:r>
+        <w:rPr>
+          <w:rFonts w:cs="Myanmar Text" w:hint="cs"/>
+          <w:cs/>
+          <w:lang w:bidi="my-MM"/>
+        </w:rPr>
+        <w:t xml:space="preserve">ဆီကနေ ရလာတဲ့ </w:t>
+      </w:r>
+      <w:r>
+        <w:rPr>
+          <w:rFonts w:cs="Myanmar Text"/>
+          <w:lang w:bidi="my-MM"/>
+        </w:rPr>
+        <w:t xml:space="preserve">system design 1 to 7 </w:t>
+      </w:r>
+      <w:r>
+        <w:rPr>
+          <w:rFonts w:cs="Myanmar Text" w:hint="cs"/>
+          <w:cs/>
+          <w:lang w:bidi="my-MM"/>
+        </w:rPr>
+        <w:t xml:space="preserve">အတွက်  </w:t>
+      </w:r>
+      <w:r>
+        <w:rPr>
+          <w:rFonts w:cs="Myanmar Text"/>
+          <w:lang w:bidi="my-MM"/>
+        </w:rPr>
+        <w:t xml:space="preserve">feedback </w:t>
+      </w:r>
+      <w:r>
+        <w:rPr>
+          <w:rFonts w:cs="Myanmar Text" w:hint="cs"/>
+          <w:cs/>
+          <w:lang w:bidi="my-MM"/>
+        </w:rPr>
+        <w:t>တွေ ပါ</w:t>
+      </w:r>
+    </w:p>
+    <w:p>
+      <w:pPr>
+        <w:tabs>
+          <w:tab w:val="left" w:pos="340"/>
+          <w:tab w:val="left" w:pos="2360"/>
+        </w:tabs>
+        <w:rPr>
+          <w:rFonts w:cs="Myanmar Text"/>
+          <w:lang w:bidi="my-MM"/>
+        </w:rPr>
+      </w:pPr>
+      <w:r>
+        <w:rPr>
+          <w:rFonts w:cs="Myanmar Text" w:hint="cs"/>
+          <w:cs/>
+          <w:lang w:bidi="my-MM"/>
+        </w:rPr>
+        <w:t>“</w:t>
+      </w:r>
+      <w:r>
+        <w:rPr>
+          <w:rFonts w:cs="Myanmar Text"/>
+          <w:cs/>
+          <w:lang w:bidi="my-MM"/>
+        </w:rPr>
+        <w:br/>
+      </w:r>
+      <w:r>
+        <w:rPr>
+          <w:rFonts w:cs="Myanmar Text"/>
+          <w:lang w:bidi="my-MM"/>
+        </w:rPr>
+        <w:t>V</w:t>
+      </w:r>
+      <w:r>
+        <w:rPr>
+          <w:rFonts w:cs="Myanmar Text"/>
+          <w:cs/>
+          <w:lang w:bidi="my-MM"/>
+        </w:rPr>
+        <w:t>1</w:t>
+      </w:r>
+      <w:r>
+        <w:rPr>
+          <w:rFonts w:cs="Myanmar Text"/>
+          <w:lang w:bidi="my-MM"/>
+        </w:rPr>
+        <w:t xml:space="preserve"> scope - Approved </w:t>
+      </w:r>
+    </w:p>
+    <w:p>
+      <w:pPr>
+        <w:tabs>
+          <w:tab w:val="left" w:pos="340"/>
+          <w:tab w:val="left" w:pos="2360"/>
+        </w:tabs>
+        <w:rPr>
+          <w:rFonts w:cs="Myanmar Text"/>
+          <w:lang w:bidi="my-MM"/>
+        </w:rPr>
+      </w:pPr>
+      <w:r>
+        <w:rPr>
+          <w:rFonts w:cs="Myanmar Text"/>
+          <w:lang w:bidi="my-MM"/>
+        </w:rPr>
+        <w:t>Unified Resume model - What is difference between VERSION / VARIANT?</w:t>
+      </w:r>
+    </w:p>
+    <w:p>
+      <w:pPr>
+        <w:tabs>
+          <w:tab w:val="left" w:pos="340"/>
+          <w:tab w:val="left" w:pos="2360"/>
+        </w:tabs>
+        <w:rPr>
+          <w:rFonts w:cs="Myanmar Text"/>
+          <w:lang w:bidi="my-MM"/>
+        </w:rPr>
+      </w:pPr>
+      <w:r>
+        <w:rPr>
+          <w:rFonts w:cs="Myanmar Text"/>
+          <w:lang w:bidi="my-MM"/>
+        </w:rPr>
+        <w:t>Runtime topology - Modular monolith - ok . no need to use any processing jobs for v</w:t>
+      </w:r>
+      <w:r>
+        <w:rPr>
+          <w:rFonts w:cs="Myanmar Text"/>
+          <w:cs/>
+          <w:lang w:bidi="my-MM"/>
+        </w:rPr>
+        <w:t xml:space="preserve">1. </w:t>
+      </w:r>
+    </w:p>
+    <w:p>
+      <w:pPr>
+        <w:tabs>
+          <w:tab w:val="left" w:pos="340"/>
+          <w:tab w:val="left" w:pos="2360"/>
+        </w:tabs>
+        <w:rPr>
+          <w:rFonts w:cs="Myanmar Text"/>
+          <w:lang w:bidi="my-MM"/>
+        </w:rPr>
+      </w:pPr>
+      <w:r>
+        <w:rPr>
+          <w:rFonts w:cs="Myanmar Text"/>
+          <w:lang w:bidi="my-MM"/>
+        </w:rPr>
+        <w:t>Technology candidates - Drizzle spike; Better Auth; R</w:t>
+      </w:r>
+      <w:r>
+        <w:rPr>
+          <w:rFonts w:cs="Myanmar Text"/>
+          <w:cs/>
+          <w:lang w:bidi="my-MM"/>
+        </w:rPr>
+        <w:t>2</w:t>
+      </w:r>
+      <w:r>
+        <w:rPr>
+          <w:rFonts w:cs="Myanmar Text"/>
+          <w:lang w:bidi="my-MM"/>
+        </w:rPr>
+        <w:t>; Railway; - OK (no PaddleOCR - just direct LLM calls)</w:t>
+      </w:r>
+    </w:p>
+    <w:p>
+      <w:pPr>
+        <w:tabs>
+          <w:tab w:val="left" w:pos="340"/>
+          <w:tab w:val="left" w:pos="2360"/>
+        </w:tabs>
+        <w:rPr>
+          <w:rFonts w:cs="Myanmar Text"/>
+          <w:lang w:bidi="my-MM"/>
+        </w:rPr>
+      </w:pPr>
+      <w:r>
+        <w:rPr>
+          <w:rFonts w:cs="Myanmar Text"/>
+          <w:cs/>
+          <w:lang w:bidi="my-MM"/>
+        </w:rPr>
+        <w:t xml:space="preserve">အဲ့တာဆို </w:t>
+      </w:r>
+      <w:r>
+        <w:rPr>
+          <w:rFonts w:cs="Myanmar Text"/>
+        </w:rPr>
+        <w:t xml:space="preserve">Version </w:t>
+      </w:r>
+      <w:r>
+        <w:rPr>
+          <w:rFonts w:cs="Myanmar Text"/>
+          <w:cs/>
+          <w:lang w:bidi="my-MM"/>
+        </w:rPr>
+        <w:t xml:space="preserve">က </w:t>
+      </w:r>
+      <w:r>
+        <w:rPr>
+          <w:rFonts w:cs="Myanmar Text"/>
+        </w:rPr>
+        <w:t xml:space="preserve">resume </w:t>
+      </w:r>
+      <w:r>
+        <w:rPr>
+          <w:rFonts w:cs="Myanmar Text"/>
+          <w:cs/>
+          <w:lang w:bidi="my-MM"/>
+        </w:rPr>
+        <w:t xml:space="preserve">ပဲပေါ့. အဲ့ </w:t>
+      </w:r>
+      <w:r>
+        <w:rPr>
+          <w:rFonts w:cs="Myanmar Text"/>
+        </w:rPr>
+        <w:t xml:space="preserve">version keyword </w:t>
+      </w:r>
+      <w:r>
+        <w:rPr>
+          <w:rFonts w:cs="Myanmar Text"/>
+          <w:cs/>
+          <w:lang w:bidi="my-MM"/>
+        </w:rPr>
+        <w:t>ကြီးကိုဖျောက်လိုက်တာကောင်းမယ် နှစ်ခုရှုပ်နေလို</w:t>
+      </w:r>
+    </w:p>
+    <w:p>
+      <w:pPr>
+        <w:tabs>
+          <w:tab w:val="left" w:pos="340"/>
+          <w:tab w:val="left" w:pos="2360"/>
+        </w:tabs>
+        <w:rPr>
+          <w:rFonts w:cs="Myanmar Text" w:hint="cs"/>
+          <w:lang w:bidi="my-MM"/>
+        </w:rPr>
+      </w:pPr>
+      <w:r>
+        <w:rPr>
+          <w:rFonts w:cs="Myanmar Text" w:hint="cs"/>
+          <w:cs/>
+          <w:lang w:bidi="my-MM"/>
+        </w:rPr>
+        <w:t>“</w:t>
+      </w:r>
+    </w:p>
+    <w:p>
+      <w:pPr>
+        <w:tabs>
+          <w:tab w:val="left" w:pos="340"/>
+          <w:tab w:val="left" w:pos="2360"/>
+        </w:tabs>
+        <w:rPr>
+          <w:rFonts w:cs="Myanmar Text" w:hint="cs"/>
+          <w:cs/>
+          <w:lang w:bidi="my-MM"/>
+        </w:rPr>
+      </w:pPr>
+      <w:r>
+        <w:rPr>
+          <w:rFonts w:cs="Myanmar Text"/>
+          <w:cs/>
+          <w:lang w:bidi="my-MM"/>
+        </w:rPr>
+        <w:br/>
+      </w:r>
+      <w:r>
+        <w:rPr>
+          <w:rFonts w:cs="Myanmar Text"/>
+          <w:lang w:bidi="my-MM"/>
+        </w:rPr>
+        <w:t xml:space="preserve">version, variation </w:t>
+      </w:r>
+      <w:r>
+        <w:rPr>
+          <w:rFonts w:cs="Myanmar Text" w:hint="cs"/>
+          <w:cs/>
+          <w:lang w:bidi="my-MM"/>
+        </w:rPr>
+        <w:t xml:space="preserve">ကို နာမည်ပဲ ချိန်းမှာပါ </w:t>
+      </w:r>
+      <w:r>
+        <w:rPr>
+          <w:rFonts w:cs="Myanmar Text"/>
+          <w:lang w:bidi="my-MM"/>
+        </w:rPr>
+        <w:t xml:space="preserve">concept </w:t>
+      </w:r>
+      <w:r>
+        <w:rPr>
+          <w:rFonts w:cs="Myanmar Text" w:hint="cs"/>
+          <w:cs/>
+          <w:lang w:bidi="my-MM"/>
+        </w:rPr>
+        <w:t>ချိန်းမှာ မဟုတ်ပါဘူး</w:t>
+      </w:r>
+      <w:r>
+        <w:rPr>
+          <w:rFonts w:cs="Myanmar Text"/>
+          <w:cs/>
+          <w:lang w:bidi="my-MM"/>
+        </w:rPr>
+        <w:br/>
+      </w:r>
+      <w:r>
+        <w:rPr>
+          <w:rFonts w:cs="Myanmar Text" w:hint="cs"/>
+          <w:cs/>
+          <w:lang w:bidi="my-MM"/>
+        </w:rPr>
+        <w:t xml:space="preserve">ဆိုတော့ ကြီးကြီးမားမား ပြောင်းလဲ သွားတာတော့ မရှိဘူး </w:t>
+      </w:r>
+      <w:r>
+        <w:rPr>
+          <w:rFonts w:cs="Myanmar Text"/>
+          <w:lang w:bidi="my-MM"/>
+        </w:rPr>
+        <w:t xml:space="preserve">paddle OCR </w:t>
+      </w:r>
+      <w:r>
+        <w:rPr>
+          <w:rFonts w:cs="Myanmar Text" w:hint="cs"/>
+          <w:cs/>
+          <w:lang w:bidi="my-MM"/>
+        </w:rPr>
+        <w:t xml:space="preserve">ကို မသုံးဖို့ တစ်ခုတော့ ပြောင်းသွားတယ် ဒါကလဲ </w:t>
+      </w:r>
+      <w:r>
+        <w:rPr>
+          <w:rFonts w:cs="Myanmar Text"/>
+          <w:lang w:bidi="my-MM"/>
+        </w:rPr>
+        <w:t xml:space="preserve">cpu gpu </w:t>
+      </w:r>
+      <w:r>
+        <w:rPr>
+          <w:rFonts w:cs="Myanmar Text" w:hint="cs"/>
+          <w:cs/>
+          <w:lang w:bidi="my-MM"/>
+        </w:rPr>
+        <w:t xml:space="preserve">ကို ကြီးကြီးမားမား ထိမှာ စိုးတာရယ် </w:t>
+      </w:r>
+      <w:r>
+        <w:rPr>
+          <w:rFonts w:cs="Myanmar Text"/>
+          <w:lang w:bidi="my-MM"/>
+        </w:rPr>
+        <w:t xml:space="preserve">cost </w:t>
+      </w:r>
+      <w:r>
+        <w:rPr>
+          <w:rFonts w:cs="Myanmar Text" w:hint="cs"/>
+          <w:cs/>
+          <w:lang w:bidi="my-MM"/>
+        </w:rPr>
+        <w:t xml:space="preserve">ချွေတာချင်တာရယ်ကြောင့်ပါ။ </w:t>
+      </w:r>
+      <w:r>
+        <w:rPr>
+          <w:rFonts w:cs="Myanmar Text"/>
+          <w:cs/>
+          <w:lang w:bidi="my-MM"/>
+        </w:rPr>
+        <w:br/>
+      </w:r>
+      <w:r>
+        <w:rPr>
+          <w:rFonts w:cs="Myanmar Text" w:hint="cs"/>
+          <w:cs/>
+          <w:lang w:bidi="my-MM"/>
+        </w:rPr>
+        <w:t xml:space="preserve">နောက်ပိုင်းမှာ </w:t>
+      </w:r>
+      <w:r>
+        <w:rPr>
+          <w:rFonts w:cs="Myanmar Text"/>
+          <w:lang w:bidi="my-MM"/>
+        </w:rPr>
+        <w:t xml:space="preserve">deployment </w:t>
+      </w:r>
+      <w:r>
+        <w:rPr>
+          <w:rFonts w:cs="Myanmar Text" w:hint="cs"/>
+          <w:cs/>
+          <w:lang w:bidi="my-MM"/>
+        </w:rPr>
+        <w:t xml:space="preserve">အပြီး </w:t>
+      </w:r>
+      <w:r>
+        <w:rPr>
+          <w:rFonts w:cs="Myanmar Text"/>
+          <w:lang w:bidi="my-MM"/>
+        </w:rPr>
+        <w:t xml:space="preserve">user growth </w:t>
+      </w:r>
+      <w:r>
+        <w:rPr>
+          <w:rFonts w:cs="Myanmar Text" w:hint="cs"/>
+          <w:cs/>
+          <w:lang w:bidi="my-MM"/>
+        </w:rPr>
+        <w:t xml:space="preserve">တိုးလာလို့ </w:t>
+      </w:r>
+      <w:r>
+        <w:rPr>
+          <w:rFonts w:cs="Myanmar Text"/>
+          <w:lang w:bidi="my-MM"/>
+        </w:rPr>
+        <w:t xml:space="preserve">OCR </w:t>
+      </w:r>
+      <w:r>
+        <w:rPr>
+          <w:rFonts w:cs="Myanmar Text" w:hint="cs"/>
+          <w:cs/>
+          <w:lang w:bidi="my-MM"/>
+        </w:rPr>
+        <w:t>သုံးဖိူ့ လိုလာတဲ့ အခါ သုံးပါမယ်။</w:t>
+      </w:r>
+      <w:r>
+        <w:rPr>
+          <w:rFonts w:cs="Myanmar Text"/>
+          <w:cs/>
+          <w:lang w:bidi="my-MM"/>
+        </w:rPr>
+        <w:br/>
+      </w:r>
+      <w:r>
+        <w:rPr>
+          <w:rFonts w:cs="Myanmar Text" w:hint="cs"/>
+          <w:cs/>
+          <w:lang w:bidi="my-MM"/>
+        </w:rPr>
+        <w:t>လောလောဆယ်တော့ ဖြုတ်လိုက်ပါမယ်</w:t>
+      </w:r>
+      <w:r>
+        <w:rPr>
+          <w:rFonts w:cs="Myanmar Text"/>
+          <w:cs/>
+          <w:lang w:bidi="my-MM"/>
+        </w:rPr>
+        <w:br/>
+      </w:r>
+      <w:r>
+        <w:rPr>
+          <w:rFonts w:cs="Myanmar Text" w:hint="cs"/>
+          <w:cs/>
+          <w:lang w:bidi="my-MM"/>
+        </w:rPr>
+        <w:t xml:space="preserve">သူကို့ ဖြုတ်မယ်ဆိုတော့ ငါတို့ဘက်က ဘာတွေ ပြောင်းလဲ သွားနိုင်မလဲ </w:t>
+      </w:r>
+      <w:r>
+        <w:rPr>
+          <w:rFonts w:cs="Myanmar Text"/>
+          <w:lang w:bidi="my-MM"/>
+        </w:rPr>
+        <w:t xml:space="preserve">system design </w:t>
+      </w:r>
+      <w:r>
+        <w:rPr>
+          <w:rFonts w:cs="Myanmar Text" w:hint="cs"/>
+          <w:cs/>
+          <w:lang w:bidi="my-MM"/>
+        </w:rPr>
+        <w:t xml:space="preserve">ကို ဘယ်လို နဲနဲ ပြန်ပြင်ရမလဲ တစ်ချက်လောက်  </w:t>
+      </w:r>
+      <w:r>
+        <w:rPr>
+          <w:rFonts w:cs="Myanmar Text"/>
+          <w:lang w:bidi="my-MM"/>
+        </w:rPr>
+        <w:t xml:space="preserve">analysis </w:t>
+      </w:r>
+      <w:r>
+        <w:rPr>
+          <w:rFonts w:cs="Myanmar Text" w:hint="cs"/>
+          <w:cs/>
+          <w:lang w:bidi="my-MM"/>
+        </w:rPr>
+        <w:t>လုပ်ပေးပါ။</w:t>
+      </w:r>
+      <w:r>
+        <w:rPr>
+          <w:rFonts w:cs="Myanmar Text"/>
+          <w:cs/>
+          <w:lang w:bidi="my-MM"/>
+        </w:rPr>
+        <w:br/>
+      </w:r>
+      <w:r>
+        <w:rPr>
+          <w:rFonts w:cs="Myanmar Text"/>
+          <w:lang w:bidi="my-MM"/>
+        </w:rPr>
+        <w:t xml:space="preserve">LLM </w:t>
+      </w:r>
+      <w:r>
+        <w:rPr>
+          <w:rFonts w:cs="Myanmar Text" w:hint="cs"/>
+          <w:cs/>
+          <w:lang w:bidi="my-MM"/>
+        </w:rPr>
+        <w:t xml:space="preserve">ကိုပဲ </w:t>
+      </w:r>
+      <w:r>
+        <w:rPr>
+          <w:rFonts w:cs="Myanmar Text" w:hint="cs"/>
+          <w:cs/>
+          <w:lang w:bidi="my-MM"/>
+        </w:rPr>
+        <w:t xml:space="preserve">တိုက်ရိုက် </w:t>
+      </w:r>
+      <w:r>
+        <w:rPr>
+          <w:rFonts w:cs="Myanmar Text"/>
+          <w:lang w:bidi="my-MM"/>
+        </w:rPr>
+        <w:t xml:space="preserve">extract </w:t>
+      </w:r>
+      <w:r>
+        <w:rPr>
+          <w:rFonts w:cs="Myanmar Text" w:hint="cs"/>
+          <w:cs/>
+          <w:lang w:bidi="my-MM"/>
+        </w:rPr>
+        <w:t xml:space="preserve">လုပ်ခိုင်းပါမယ်တဲ့ </w:t>
+      </w:r>
+      <w:r>
+        <w:rPr>
+          <w:rFonts w:cs="Myanmar Text"/>
+          <w:lang w:bidi="my-MM"/>
+        </w:rPr>
+        <w:t xml:space="preserve">maybe stronger model candidate </w:t>
+      </w:r>
+      <w:r>
+        <w:rPr>
+          <w:rFonts w:cs="Myanmar Text" w:hint="cs"/>
+          <w:cs/>
+          <w:lang w:bidi="my-MM"/>
+        </w:rPr>
+        <w:t xml:space="preserve">ကို သုံးပြီး </w:t>
+      </w:r>
+      <w:r>
+        <w:rPr>
+          <w:rFonts w:cs="Myanmar Text"/>
+          <w:lang w:bidi="my-MM"/>
+        </w:rPr>
+        <w:t xml:space="preserve">extract </w:t>
+      </w:r>
+      <w:r>
+        <w:rPr>
+          <w:rFonts w:cs="Myanmar Text" w:hint="cs"/>
+          <w:cs/>
+          <w:lang w:bidi="my-MM"/>
+        </w:rPr>
+        <w:t xml:space="preserve">လုပ်တာဖြစ်ဖြစ် ဒါမှမဟုတ် </w:t>
+      </w:r>
+      <w:r>
+        <w:rPr>
+          <w:rFonts w:cs="Myanmar Text"/>
+          <w:lang w:bidi="my-MM"/>
+        </w:rPr>
+        <w:t xml:space="preserve">context engineering </w:t>
+      </w:r>
+      <w:r>
+        <w:rPr>
+          <w:rFonts w:cs="Myanmar Text" w:hint="cs"/>
+          <w:cs/>
+          <w:lang w:bidi="my-MM"/>
+        </w:rPr>
+        <w:t xml:space="preserve">ကောင်းကောင်းနဲ့ ထိန်းချုပ်ပြီး </w:t>
+      </w:r>
+      <w:r>
+        <w:rPr>
+          <w:rFonts w:cs="Myanmar Text"/>
+          <w:lang w:bidi="my-MM"/>
+        </w:rPr>
+        <w:t xml:space="preserve">extract </w:t>
+      </w:r>
+      <w:r>
+        <w:rPr>
+          <w:rFonts w:cs="Myanmar Text" w:hint="cs"/>
+          <w:cs/>
+          <w:lang w:bidi="my-MM"/>
+        </w:rPr>
+        <w:t>လုပ်တာဖြစ်ဖြစ် ပေါ့</w:t>
+      </w:r>
+      <w:r>
+        <w:rPr>
+          <w:rFonts w:cs="Myanmar Text"/>
+          <w:cs/>
+          <w:lang w:bidi="my-MM"/>
+        </w:rPr>
+        <w:br/>
+      </w:r>
+      <w:r>
+        <w:rPr>
+          <w:rFonts w:cs="Myanmar Text" w:hint="cs"/>
+          <w:cs/>
+          <w:lang w:bidi="my-MM"/>
+        </w:rPr>
+        <w:t xml:space="preserve">ပြီးတော့ </w:t>
+      </w:r>
+      <w:r>
+        <w:rPr>
+          <w:rFonts w:ascii="Myanmar Text" w:hAnsi="Myanmar Text" w:cs="Myanmar Text"/>
+          <w:lang w:bidi="my-MM"/>
+        </w:rPr>
+        <w:t xml:space="preserve">extract </w:t>
+      </w:r>
+      <w:r>
+        <w:rPr>
+          <w:rFonts w:ascii="Myanmar Text" w:hAnsi="Myanmar Text" w:cs="Myanmar Text" w:hint="cs"/>
+          <w:cs/>
+          <w:lang w:bidi="my-MM"/>
+        </w:rPr>
+        <w:t xml:space="preserve">ထုတ်တာ ငါးဆယ် ရာခိုင်နှုန်းအောက်ပဲ ရမယ်ဆိုရင် ( ပြောရရင် မရှင်းမလင်း ဖြစ်နေတဲ့ ပုံတွေထဲကနေ </w:t>
+      </w:r>
+      <w:r>
+        <w:rPr>
+          <w:rFonts w:ascii="Myanmar Text" w:hAnsi="Myanmar Text" w:cs="Myanmar Text"/>
+          <w:lang w:bidi="my-MM"/>
+        </w:rPr>
+        <w:t xml:space="preserve">resume data </w:t>
+      </w:r>
+      <w:r>
+        <w:rPr>
+          <w:rFonts w:ascii="Myanmar Text" w:hAnsi="Myanmar Text" w:cs="Myanmar Text" w:hint="cs"/>
+          <w:cs/>
+          <w:lang w:bidi="my-MM"/>
+        </w:rPr>
+        <w:t xml:space="preserve">တွေကို ထုတ်တဲ့ အခါ မျိုးမှာပေါ့ ) </w:t>
+      </w:r>
+      <w:r>
+        <w:rPr>
+          <w:rFonts w:ascii="Myanmar Text" w:hAnsi="Myanmar Text" w:cs="Myanmar Text"/>
+          <w:cs/>
+          <w:lang w:bidi="my-MM"/>
+        </w:rPr>
+        <w:br/>
+      </w:r>
+      <w:r>
+        <w:rPr>
+          <w:rFonts w:ascii="Myanmar Text" w:hAnsi="Myanmar Text" w:cs="Myanmar Text" w:hint="cs"/>
+          <w:cs/>
+          <w:lang w:bidi="my-MM"/>
+        </w:rPr>
+        <w:t xml:space="preserve">ဆက်မထုတ်ဖို့နဲ့ နောက်ထပ် အသစ် </w:t>
+      </w:r>
+      <w:r>
+        <w:rPr>
+          <w:rFonts w:ascii="Myanmar Text" w:hAnsi="Myanmar Text" w:cs="Myanmar Text"/>
+          <w:lang w:bidi="my-MM"/>
+        </w:rPr>
+        <w:t xml:space="preserve">upload </w:t>
+      </w:r>
+      <w:r>
+        <w:rPr>
+          <w:rFonts w:ascii="Myanmar Text" w:hAnsi="Myanmar Text" w:cs="Myanmar Text" w:hint="cs"/>
+          <w:cs/>
+          <w:lang w:bidi="my-MM"/>
+        </w:rPr>
+        <w:t xml:space="preserve">တောင်းတာရယ် ဒါမှမဟုတ် </w:t>
+      </w:r>
+      <w:r>
+        <w:rPr>
+          <w:rFonts w:ascii="Myanmar Text" w:hAnsi="Myanmar Text" w:cs="Myanmar Text"/>
+          <w:lang w:bidi="my-MM"/>
+        </w:rPr>
+        <w:t xml:space="preserve">another entry, form or chat </w:t>
+      </w:r>
+      <w:r>
+        <w:rPr>
+          <w:rFonts w:ascii="Myanmar Text" w:hAnsi="Myanmar Text" w:cs="Myanmar Text" w:hint="cs"/>
+          <w:cs/>
+          <w:lang w:bidi="my-MM"/>
+        </w:rPr>
+        <w:t xml:space="preserve">ကို သုံးပြီး </w:t>
+      </w:r>
+      <w:r>
+        <w:rPr>
+          <w:rFonts w:ascii="Myanmar Text" w:hAnsi="Myanmar Text" w:cs="Myanmar Text"/>
+          <w:lang w:bidi="my-MM"/>
+        </w:rPr>
+        <w:t xml:space="preserve">cv </w:t>
+      </w:r>
+      <w:r>
+        <w:rPr>
+          <w:rFonts w:ascii="Myanmar Text" w:hAnsi="Myanmar Text" w:cs="Myanmar Text" w:hint="cs"/>
+          <w:cs/>
+          <w:lang w:bidi="my-MM"/>
+        </w:rPr>
+        <w:t xml:space="preserve">တစ်စောင် ပြုလုပ်ဖို့ လမ်းညွှန် ခိုင်းမှာရယ်က အစောပိုင်းမှာ </w:t>
+      </w:r>
+      <w:r>
+        <w:rPr>
+          <w:rFonts w:ascii="Myanmar Text" w:hAnsi="Myanmar Text" w:cs="Myanmar Text"/>
+          <w:lang w:bidi="my-MM"/>
+        </w:rPr>
+        <w:t xml:space="preserve">lock </w:t>
+      </w:r>
+      <w:r>
+        <w:rPr>
+          <w:rFonts w:ascii="Myanmar Text" w:hAnsi="Myanmar Text" w:cs="Myanmar Text" w:hint="cs"/>
+          <w:cs/>
+          <w:lang w:bidi="my-MM"/>
+        </w:rPr>
+        <w:t>လုပ်ထားပြီးသား ရှိပါတယ်</w:t>
+      </w:r>
+      <w:r>
+        <w:rPr>
+          <w:rFonts w:ascii="Myanmar Text" w:hAnsi="Myanmar Text" w:cs="Myanmar Text"/>
+          <w:cs/>
+          <w:lang w:bidi="my-MM"/>
+        </w:rPr>
+        <w:br/>
+      </w:r>
+      <w:r>
+        <w:rPr>
+          <w:rFonts w:ascii="Myanmar Text" w:hAnsi="Myanmar Text" w:cs="Myanmar Text" w:hint="cs"/>
+          <w:cs/>
+          <w:lang w:bidi="my-MM"/>
+        </w:rPr>
+        <w:t xml:space="preserve">အဲ့တော့ </w:t>
+      </w:r>
+      <w:r>
+        <w:rPr>
+          <w:rFonts w:ascii="Myanmar Text" w:hAnsi="Myanmar Text" w:cs="Myanmar Text"/>
+          <w:lang w:bidi="my-MM"/>
+        </w:rPr>
+        <w:t xml:space="preserve">LLM </w:t>
+      </w:r>
+      <w:r>
+        <w:rPr>
+          <w:rFonts w:ascii="Myanmar Text" w:hAnsi="Myanmar Text" w:cs="Myanmar Text" w:hint="cs"/>
+          <w:cs/>
+          <w:lang w:bidi="my-MM"/>
+        </w:rPr>
+        <w:t xml:space="preserve">ကို သုံးပြီး </w:t>
+      </w:r>
+      <w:r>
+        <w:rPr>
+          <w:rFonts w:ascii="Myanmar Text" w:hAnsi="Myanmar Text" w:cs="Myanmar Text"/>
+          <w:lang w:bidi="my-MM"/>
+        </w:rPr>
+        <w:t xml:space="preserve">extract </w:t>
+      </w:r>
+      <w:r>
+        <w:rPr>
+          <w:rFonts w:ascii="Myanmar Text" w:hAnsi="Myanmar Text" w:cs="Myanmar Text" w:hint="cs"/>
+          <w:cs/>
+          <w:lang w:bidi="my-MM"/>
+        </w:rPr>
+        <w:t xml:space="preserve">သုံးပြီး </w:t>
+      </w:r>
+      <w:r>
+        <w:rPr>
+          <w:rFonts w:ascii="Myanmar Text" w:hAnsi="Myanmar Text" w:cs="Myanmar Text"/>
+          <w:lang w:bidi="my-MM"/>
+        </w:rPr>
+        <w:t xml:space="preserve">extract </w:t>
+      </w:r>
+      <w:r>
+        <w:rPr>
+          <w:rFonts w:ascii="Myanmar Text" w:hAnsi="Myanmar Text" w:cs="Myanmar Text" w:hint="cs"/>
+          <w:cs/>
+          <w:lang w:bidi="my-MM"/>
+        </w:rPr>
+        <w:t xml:space="preserve">လုပ်မယ်ဆိုလဲ ကြီးကြီးမားမားတော့ ပြဿနာရှိလာနိုင်မယ်တော့ မထင်သေးဘူး ဘယ်လို </w:t>
+      </w:r>
+      <w:r>
+        <w:rPr>
+          <w:rFonts w:ascii="Myanmar Text" w:hAnsi="Myanmar Text" w:cs="Myanmar Text"/>
+          <w:lang w:bidi="my-MM"/>
+        </w:rPr>
+        <w:t xml:space="preserve">issue </w:t>
+      </w:r>
+      <w:r>
+        <w:rPr>
+          <w:rFonts w:ascii="Myanmar Text" w:hAnsi="Myanmar Text" w:cs="Myanmar Text" w:hint="cs"/>
+          <w:cs/>
+          <w:lang w:bidi="my-MM"/>
+        </w:rPr>
+        <w:t xml:space="preserve">တွေ ရှိလာနိုင်လဲ ဘယ်လို ကာကွယ်နိုင်မလဲ စဥ်းစားပြီး </w:t>
+      </w:r>
+      <w:r>
+        <w:rPr>
+          <w:rFonts w:ascii="Myanmar Text" w:hAnsi="Myanmar Text" w:cs="Myanmar Text"/>
+          <w:lang w:bidi="my-MM"/>
+        </w:rPr>
+        <w:t xml:space="preserve">recommend </w:t>
+      </w:r>
+      <w:r>
+        <w:rPr>
+          <w:rFonts w:ascii="Myanmar Text" w:hAnsi="Myanmar Text" w:cs="Myanmar Text" w:hint="cs"/>
+          <w:cs/>
+          <w:lang w:bidi="my-MM"/>
+        </w:rPr>
+        <w:t>လုပ်ပေးပါအုံး။</w:t>
+      </w:r>
+      <w:r>
+        <w:rPr>
+          <w:rFonts w:cs="Myanmar Text"/>
+          <w:cs/>
+          <w:lang w:bidi="my-MM"/>
+        </w:rPr>
+        <w:br/>
+      </w:r>
+    </w:p>
+    <w:p>
+      <w:pPr>
+        <w:tabs>
+          <w:tab w:val="left" w:pos="340"/>
+          <w:tab w:val="left" w:pos="2360"/>
+        </w:tabs>
+        <w:rPr>
+          <w:rFonts w:cs="Myanmar Text"/>
+          <w:lang w:bidi="my-MM"/>
+        </w:rPr>
+      </w:pPr>
+    </w:p>
+    <w:p>
+      <w:pPr>
+        <w:tabs>
+          <w:tab w:val="left" w:pos="340"/>
+          <w:tab w:val="left" w:pos="2360"/>
+        </w:tabs>
+        <w:rPr>
+          <w:rFonts w:cs="Myanmar Text"/>
+          <w:lang w:bidi="my-MM"/>
+        </w:rPr>
+      </w:pPr>
+    </w:p>
+    <w:p>
+      <w:pPr>
+        <w:tabs>
+          <w:tab w:val="left" w:pos="340"/>
+          <w:tab w:val="left" w:pos="2360"/>
+        </w:tabs>
+        <w:rPr>
+          <w:rFonts w:cs="Myanmar Text"/>
+          <w:cs/>
+          <w:lang w:bidi="my-MM"/>
+        </w:rPr>
+      </w:pPr>
     </w:p>
     <w:sectPr>
       <w:pgSz w:w="12240" w:h="15840"/>

</xml_diff>